<commit_message>
feat: set up the fstpindia package skeleton
Turn the repo into the R data package fstpindia, following the washr
workflow. An R package's data/ folder may only hold .rda files, so
the PDF, the hand-typed BOD file, the Table 9 CSV and its script move
to data-raw/, and the codebook goes there until washr writes the
dictionary. The analysis documents read from the new paths, and their
text changes only in those paths. R CMD check passes with no notes.

Prompts:
- 2026-09-29-008-work-through-issues-1-2-commit
Closes #3
Assisted-by: Claude claude-fable-5-1
Claude-Session: https://claude.ai/code/session_019TExKjX47DroSeBXFp3g1D
</commit_message>
<xml_diff>
--- a/analysis/bod-compliance.docx
+++ b/analysis/bod-compliance.docx
@@ -142,7 +142,7 @@
         <w:rPr>
           <w:rStyle w:val="VerbatimChar"/>
         </w:rPr>
-        <w:t xml:space="preserve">data/raw_data/1689832445895.pdf</w:t>
+        <w:t xml:space="preserve">data-raw/1689832445895.pdf</w:t>
       </w:r>
       <w:r>
         <w:t xml:space="preserve">. CSE sampled the plants over two years starting in 2021, in Telangana, Tamil Nadu, Odisha, Rajasthan, Uttar Pradesh, Uttarakhand, Madhya Pradesh and Chhattisgarh. Of the 69 plants, 47 are FSTPs and 22 are STPs with co-treatment of faecal sludge. For each plant, the report gives the average of the samples taken from the treated discharge water. Four more FSTPs in Odisha (Surada, Kashinagar, Hinjilicut and Talcher) had no outlet water at the time of sampling, so the report has no effluent data for them and we left them out.</w:t>
@@ -172,7 +172,7 @@
         <w:rPr>
           <w:rStyle w:val="VerbatimChar"/>
         </w:rPr>
-        <w:t xml:space="preserve">data/derived_data/bod-discharge.csv</w:t>
+        <w:t xml:space="preserve">data-raw/bod-discharge.csv</w:t>
       </w:r>
       <w:r>
         <w:t xml:space="preserve">:</w:t>

</xml_diff>